<commit_message>
docs(report): describe the microservices in production and the migration in progress
</commit_message>
<xml_diff>
--- a/Informe tecnico/INFORME TECNICO (1) (1).docx
+++ b/Informe tecnico/INFORME TECNICO (1) (1).docx
@@ -1889,6 +1889,226 @@
         <w:t xml:space="preserve">El siguiente cuadro presenta el resumen ejecutivo del presupuesto del proyecto, donde se detallan los costos estimados en hardware, software, recurso humano y el total consolidado de la inversión. Para consultar la información completa, diríjase al archivo en formato Excel titulado “Costos finales”.</w:t>
       </w:r>
     </w:p>
+    <w:tbl>
+      <w:tblPr>
+        <w:tblW w:type="auto" w:w="0"/>
+        <w:tblLook w:firstColumn="1" w:firstRow="1" w:lastColumn="0" w:lastRow="0" w:noHBand="0" w:noVBand="1" w:val="04A0"/>
+        <w:tblBorders>
+          <w:top w:val="single" w:sz="4" w:color="808080"/>
+          <w:left w:val="single" w:sz="4" w:color="808080"/>
+          <w:bottom w:val="single" w:sz="4" w:color="808080"/>
+          <w:right w:val="single" w:sz="4" w:color="808080"/>
+          <w:insideH w:val="single" w:sz="4" w:color="808080"/>
+          <w:insideV w:val="single" w:sz="4" w:color="808080"/>
+        </w:tblBorders>
+      </w:tblPr>
+      <w:tblGrid>
+        <w:gridCol w:w="4419"/>
+        <w:gridCol w:w="4419"/>
+      </w:tblGrid>
+      <w:tr>
+        <w:tc>
+          <w:tcPr>
+            <w:tcW w:type="dxa" w:w="4419"/>
+          </w:tcPr>
+          <w:p>
+            <w:r/>
+            <w:r>
+              <w:rPr>
+                <w:b/>
+                <w:sz w:val="22"/>
+              </w:rPr>
+              <w:t>Ítem</w:t>
+            </w:r>
+          </w:p>
+        </w:tc>
+        <w:tc>
+          <w:tcPr>
+            <w:tcW w:type="dxa" w:w="4419"/>
+          </w:tcPr>
+          <w:p>
+            <w:pPr>
+              <w:jc w:val="right"/>
+            </w:pPr>
+            <w:r/>
+            <w:r>
+              <w:rPr>
+                <w:b/>
+                <w:sz w:val="22"/>
+              </w:rPr>
+              <w:t>Costo (COP)</w:t>
+            </w:r>
+          </w:p>
+        </w:tc>
+      </w:tr>
+      <w:tr>
+        <w:tc>
+          <w:tcPr>
+            <w:tcW w:type="dxa" w:w="4419"/>
+          </w:tcPr>
+          <w:p>
+            <w:r/>
+            <w:r>
+              <w:rPr>
+                <w:sz w:val="22"/>
+              </w:rPr>
+              <w:t>Hardware</w:t>
+            </w:r>
+          </w:p>
+        </w:tc>
+        <w:tc>
+          <w:tcPr>
+            <w:tcW w:type="dxa" w:w="4419"/>
+          </w:tcPr>
+          <w:p>
+            <w:pPr>
+              <w:jc w:val="right"/>
+            </w:pPr>
+            <w:r/>
+            <w:r>
+              <w:rPr>
+                <w:sz w:val="22"/>
+              </w:rPr>
+              <w:t>8.073.997</w:t>
+            </w:r>
+          </w:p>
+        </w:tc>
+      </w:tr>
+      <w:tr>
+        <w:tc>
+          <w:tcPr>
+            <w:tcW w:type="dxa" w:w="4419"/>
+          </w:tcPr>
+          <w:p>
+            <w:r/>
+            <w:r>
+              <w:rPr>
+                <w:sz w:val="22"/>
+              </w:rPr>
+              <w:t>Software e infraestructura (VPS Hostinger KVM 2 + dominio)</w:t>
+            </w:r>
+          </w:p>
+        </w:tc>
+        <w:tc>
+          <w:tcPr>
+            <w:tcW w:type="dxa" w:w="4419"/>
+          </w:tcPr>
+          <w:p>
+            <w:pPr>
+              <w:jc w:val="right"/>
+            </w:pPr>
+            <w:r/>
+            <w:r>
+              <w:rPr>
+                <w:sz w:val="22"/>
+              </w:rPr>
+              <w:t>743.600</w:t>
+            </w:r>
+          </w:p>
+        </w:tc>
+      </w:tr>
+      <w:tr>
+        <w:tc>
+          <w:tcPr>
+            <w:tcW w:type="dxa" w:w="4419"/>
+          </w:tcPr>
+          <w:p>
+            <w:r/>
+            <w:r>
+              <w:rPr>
+                <w:sz w:val="22"/>
+              </w:rPr>
+              <w:t>Recurso humano (7 meses)</w:t>
+            </w:r>
+          </w:p>
+        </w:tc>
+        <w:tc>
+          <w:tcPr>
+            <w:tcW w:type="dxa" w:w="4419"/>
+          </w:tcPr>
+          <w:p>
+            <w:pPr>
+              <w:jc w:val="right"/>
+            </w:pPr>
+            <w:r/>
+            <w:r>
+              <w:rPr>
+                <w:sz w:val="22"/>
+              </w:rPr>
+              <w:t>48.900.000</w:t>
+            </w:r>
+          </w:p>
+        </w:tc>
+      </w:tr>
+      <w:tr>
+        <w:tc>
+          <w:tcPr>
+            <w:tcW w:type="dxa" w:w="4419"/>
+          </w:tcPr>
+          <w:p>
+            <w:r/>
+            <w:r>
+              <w:rPr>
+                <w:sz w:val="22"/>
+              </w:rPr>
+              <w:t>Otros</w:t>
+            </w:r>
+          </w:p>
+        </w:tc>
+        <w:tc>
+          <w:tcPr>
+            <w:tcW w:type="dxa" w:w="4419"/>
+          </w:tcPr>
+          <w:p>
+            <w:pPr>
+              <w:jc w:val="right"/>
+            </w:pPr>
+            <w:r/>
+            <w:r>
+              <w:rPr>
+                <w:sz w:val="22"/>
+              </w:rPr>
+              <w:t>0</w:t>
+            </w:r>
+          </w:p>
+        </w:tc>
+      </w:tr>
+      <w:tr>
+        <w:tc>
+          <w:tcPr>
+            <w:tcW w:type="dxa" w:w="4419"/>
+          </w:tcPr>
+          <w:p>
+            <w:r/>
+            <w:r>
+              <w:rPr>
+                <w:b/>
+                <w:sz w:val="22"/>
+              </w:rPr>
+              <w:t>Total</w:t>
+            </w:r>
+          </w:p>
+        </w:tc>
+        <w:tc>
+          <w:tcPr>
+            <w:tcW w:type="dxa" w:w="4419"/>
+          </w:tcPr>
+          <w:p>
+            <w:pPr>
+              <w:jc w:val="right"/>
+            </w:pPr>
+            <w:r/>
+            <w:r>
+              <w:rPr>
+                <w:b/>
+                <w:sz w:val="22"/>
+              </w:rPr>
+              <w:t>57.717.597</w:t>
+            </w:r>
+          </w:p>
+        </w:tc>
+      </w:tr>
+    </w:tbl>
     <w:p>
       <w:pPr>
         <w:rPr>
@@ -1951,21 +2171,21 @@
           <w:rFonts w:ascii="Arial" w:cs="Arial" w:eastAsia="Arial" w:hAnsi="Arial"/>
           <w:rtl w:val="0"/>
         </w:rPr>
-        <w:t xml:space="preserve">El sistema combina hardware y software de manera integrada: mediante sensores y un microcontrolador ESP32 se realiza la medición del consumo, mientras que la información recolectada se procesa y visualiza en una aplicación móvil y una plataforma web. Estas herramientas permiten al usuario identificar los dispositivos de mayor consumo, configurar alertas cuando se superen umbrales establecidos y recibir recomendaciones personalizadas para optimizar el uso de la energía.</w:t>
-      </w:r>
-    </w:p>
-    <w:p>
-      <w:pPr>
-        <w:rPr>
-          <w:rFonts w:ascii="Arial" w:cs="Arial" w:eastAsia="Arial" w:hAnsi="Arial"/>
-        </w:rPr>
-      </w:pPr>
-      <w:r>
-        <w:rPr>
-          <w:rFonts w:ascii="Arial" w:cs="Arial" w:eastAsia="Arial" w:hAnsi="Arial"/>
-          <w:rtl w:val="0"/>
-        </w:rPr>
-        <w:t>Con un enfoque accesible y escalable, este proyecto no solo busca generar un beneficio económico en los hogares al disminuir los costos de la electricidad, sino también aportar al cuidado del medio ambiente mediante la reducción de desperdicios energéticos. En ese sentido, el EnergyMonitor se concibe como una solución práctica, innovadora y con impacto social, alineada con los objetivos de sostenibilidad y transformación digital del país.</w:t>
+        <w:t>El sistema combina hardware y software de manera integrada: un microcontrolador ESP32 con el medidor PZEM-004T V3 mide tensión, corriente, potencia activa y energía, y publica las lecturas cada 60 segundos; la información se procesa y se visualiza en una aplicación web y una aplicación móvil Android. Estas herramientas permiten al usuario identificar los dispositivos de mayor consumo, configurar umbrales con alertas cuando se superen y recibir recomendaciones generadas a partir de su propio comportamiento de consumo.</w:t>
+      </w:r>
+    </w:p>
+    <w:p>
+      <w:pPr>
+        <w:rPr>
+          <w:rFonts w:ascii="Arial" w:cs="Arial" w:eastAsia="Arial" w:hAnsi="Arial"/>
+        </w:rPr>
+      </w:pPr>
+      <w:r>
+        <w:rPr>
+          <w:rFonts w:ascii="Arial" w:cs="Arial" w:eastAsia="Arial" w:hAnsi="Arial"/>
+          <w:rtl w:val="0"/>
+        </w:rPr>
+        <w:t>Con un enfoque accesible y escalable, este proyecto busca generar un beneficio económico en los hogares al ayudar a reducir el consumo eléctrico (el sistema reporta energía en kWh; no calcula el valor facturado, pues no existe un acuerdo con ninguna empresa de energía) y aportar al cuidado del medio ambiente mediante la reducción de desperdicios energéticos. En ese sentido, EnergyMonitor se concibe como una solución práctica, innovadora y con impacto social, alineada con los objetivos de sostenibilidad y transformación digital del país.</w:t>
       </w:r>
     </w:p>
     <w:p>
@@ -2037,7 +2257,7 @@
           <w:rFonts w:ascii="Arial" w:cs="Arial" w:eastAsia="Arial" w:hAnsi="Arial"/>
           <w:rtl w:val="0"/>
         </w:rPr>
-        <w:t xml:space="preserve">Este sistema no solo busca optimizar el uso de la energía a nivel individual, reduciendo costos en las facturas del servicio, sino también fomentar prácticas sostenibles que contribuyan a la eficiencia energética y a la reducción del impacto ambiental.</w:t>
+        <w:t>Este sistema no solo busca optimizar el uso de la energía a nivel individual, sino también fomentar prácticas sostenibles que contribuyan a la eficiencia energética y a la reducción del impacto ambiental.</w:t>
       </w:r>
     </w:p>
     <w:p>
@@ -2219,7 +2439,7 @@
           <w:vertAlign w:val="baseline"/>
           <w:rtl w:val="0"/>
         </w:rPr>
-        <w:t xml:space="preserve">Implementar un sistema de adquisición de datos basado en sensores de corriente y el microcontrolador ESP32, que registre con precisión los valores de consumo energético.</w:t>
+        <w:t>Implementar un sistema de adquisición de datos basado en el medidor PZEM-004T V3 y el microcontrolador ESP32, que registre tensión, corriente, potencia y energía y las envíe al servidor por MQTT sobre TLS.</w:t>
       </w:r>
     </w:p>
     <w:p>
@@ -2276,7 +2496,7 @@
           <w:vertAlign w:val="baseline"/>
           <w:rtl w:val="0"/>
         </w:rPr>
-        <w:t xml:space="preserve">Integrar una base de datos en la nube que almacene de forma segura el histórico de consumos, alertas y configuraciones personalizadas de los usuarios.</w:t>
+        <w:t>Integrar una base de datos MySQL 8.4 (gestionada con Liquibase) desplegada en un servidor VPS de Hostinger, que almacene de forma segura el histórico de consumos, alertas y configuraciones personalizadas de los usuarios.</w:t>
       </w:r>
     </w:p>
     <w:p>
@@ -2333,7 +2553,7 @@
           <w:vertAlign w:val="baseline"/>
           <w:rtl w:val="0"/>
         </w:rPr>
-        <w:t xml:space="preserve">Incorporar un módulo de notificaciones y alertas en tiempo real cuando se superen los umbrales de consumo predefinidos.</w:t>
+        <w:t>Incorporar un módulo de notificaciones y alertas cuando se superen los umbrales de consumo configurados o un dispositivo deje de reportar. Las alertas y recomendaciones se entregan por correo electrónico (SMTP) y Web Push en el navegador; la aplicación móvil las consulta cada 30 segundos.</w:t>
       </w:r>
     </w:p>
     <w:p>
@@ -2390,7 +2610,7 @@
           <w:vertAlign w:val="baseline"/>
           <w:rtl w:val="0"/>
         </w:rPr>
-        <w:t xml:space="preserve">Desarrollar un sistema de análisis y generación de recomendaciones personalizadas que fomente hábitos de consumo más eficientes.</w:t>
+        <w:t>Desarrollar un módulo de recomendaciones personalizadas, generadas a partir del comportamiento de consumo medido en cada hogar, que fomente hábitos de consumo más eficientes.</w:t>
       </w:r>
     </w:p>
     <w:p>
@@ -2447,7 +2667,7 @@
           <w:vertAlign w:val="baseline"/>
           <w:rtl w:val="0"/>
         </w:rPr>
-        <w:t xml:space="preserve">Establecer un panel administrativo que permita supervisar usuarios, dispositivos y métricas globales de consumo, con el fin de apoyar la gestión y escalabilidad del sistema.</w:t>
+        <w:t>Gestionar la seguridad y la administración del sistema (roles y permisos, política de contraseñas, bloqueo de cuentas y bitácora de auditoría) mediante endpoints del servicio de seguridad, publicados a través del API gateway. Una interfaz de administración dedicada queda fuera del alcance de esta versión.</w:t>
       </w:r>
     </w:p>
     <w:p>
@@ -2504,7 +2724,7 @@
           <w:vertAlign w:val="baseline"/>
           <w:rtl w:val="0"/>
         </w:rPr>
-        <w:t>Garantizar la compatibilidad del sistema con dispositivos móviles Android y navegadores web modernos, asegurando accesibilidad y usabilidad.</w:t>
+        <w:t>Garantizar la compatibilidad del sistema con dispositivos móviles Android y navegadores web modernos (la vinculación del módulo por Bluetooth requiere Chrome o un navegador con Web Bluetooth; en los demás se usa el portal de configuración Wi-Fi).</w:t>
       </w:r>
     </w:p>
     <w:p>
@@ -2598,21 +2818,21 @@
           <w:rFonts w:ascii="Arial" w:cs="Arial" w:eastAsia="Arial" w:hAnsi="Arial"/>
           <w:rtl w:val="0"/>
         </w:rPr>
-        <w:t xml:space="preserve">Para el desarrollo del sistema se utilizarán herramientas de software que garanticen eficiencia, escalabilidad y facilidad de integración. El backend y la lógica principal del sistema se implementarán en Java usando el framework Spring Boot, mientras que el entorno de programación seleccionado será Visual Studio Code, debido a su ligereza, flexibilidad y amplia compatibilidad con extensiones de desarrollo modernas. Además, se hará uso de software complementario como Firebase/Node-RED para la gestión de datos en tiempo real y la integración con la nube, tal como se describe en el documento de costos del proyecto.</w:t>
-      </w:r>
-    </w:p>
-    <w:p>
-      <w:pPr>
-        <w:rPr>
-          <w:rFonts w:ascii="Arial" w:cs="Arial" w:eastAsia="Arial" w:hAnsi="Arial"/>
-        </w:rPr>
-      </w:pPr>
-      <w:r>
-        <w:rPr>
-          <w:rFonts w:ascii="Arial" w:cs="Arial" w:eastAsia="Arial" w:hAnsi="Arial"/>
-          <w:rtl w:val="0"/>
-        </w:rPr>
-        <w:t xml:space="preserve">Con esta combinación tecnológica, se busca asegurar un entorno de desarrollo robusto y adaptable, que permita tanto la construcción del prototipo como su futura escalabilidad hacia un sistema más complejo y distribuido.</w:t>
+        <w:t>Para el desarrollo del sistema se utilizan herramientas de software libre que garantizan eficiencia, escalabilidad y facilidad de integración. El backend, desarrollado en Java 21 con Spring Boot 4.1.1, Spring Security y Spring Data JPA, evolucionó de un monolito modular a una arquitectura de microservicios: los contextos de seguridad, dispositivos y mediciones funcionan como servicios independientes (puertos 8082, 8084 y 8085) detrás de un API gateway construido con Spring Cloud Gateway (puerto 8080), que es la única entrada de la API REST bajo /api/v1; los contextos de hogares, alertas, recomendaciones y notificaciones permanecen en el backend como monolito modular con Spring Modulith (puerto 8083), y su migración a microservicios se encuentra en curso. Los servicios se comunican mediante llamadas REST internas y eventos publicados en RabbitMQ 4.1 con el patrón transactional outbox, y comparten una única base de datos MySQL 8.4 en la que cada servicio es dueño de sus tablas y aplica sus propias migraciones con Liquibase. La seguridad usa JWT firmado con RS256 (access token de 15 minutos) y refresh tokens con rotación. El dispositivo es un ESP32 con sensor PZEM-004T V3 que publica por MQTT 3.1.1 sobre TLS (puerto 8883) a un broker Eclipse Mosquitto, que autentica cada dispositivo consultando al servicio de dispositivos; el servicio de mediciones es el encargado de almacenar la telemetría. El cliente web usa React 19 y Vite 8, y la aplicación móvil (solo Android) usa Expo SDK 57 y React Native 0.86. El entorno de programación es Visual Studio Code y el despliegue se realiza con Docker Compose en un VPS de Hostinger (plan KVM 2: 2 vCPU, 8 GB de RAM y 100 GB NVMe), con Nginx y certificados Let's Encrypt como proxy HTTPS y GitHub Actions para la integración y el despliegue continuos de cada servicio. El sistema se encuentra en producción en https://energy-monitor.tech desde el 24 de octubre de 2026.</w:t>
+      </w:r>
+    </w:p>
+    <w:p>
+      <w:pPr>
+        <w:rPr>
+          <w:rFonts w:ascii="Arial" w:cs="Arial" w:eastAsia="Arial" w:hAnsi="Arial"/>
+        </w:rPr>
+      </w:pPr>
+      <w:r>
+        <w:rPr>
+          <w:rFonts w:ascii="Arial" w:cs="Arial" w:eastAsia="Arial" w:hAnsi="Arial"/>
+          <w:rtl w:val="0"/>
+        </w:rPr>
+        <w:t>Con esta combinación tecnológica se obtiene un entorno robusto y adaptable, que permite construir el prototipo y escalar a más hogares y dispositivos aumentando los recursos del servidor; además, la separación en servicios permite desplegar y actualizar cada uno de forma independiente.</w:t>
       </w:r>
     </w:p>
     <w:p>
@@ -2925,7 +3145,7 @@
                 <w:szCs w:val="22"/>
                 <w:rtl w:val="0"/>
               </w:rPr>
-              <w:t xml:space="preserve">Juan Esteban Cortez Parra</w:t>
+              <w:t>Juan Esteban Cortés Parra</w:t>
             </w:r>
           </w:p>
         </w:tc>
@@ -3085,7 +3305,7 @@
                 <w:szCs w:val="22"/>
                 <w:rtl w:val="0"/>
               </w:rPr>
-              <w:t xml:space="preserve">Miguel Ángel García Artunduaga/Juan Esteban Cortez Parra</w:t>
+              <w:t>Miguel Ángel García Artunduaga/Juan Esteban Cortés Parra</w:t>
             </w:r>
             <w:r>
               <w:rPr>
@@ -3442,7 +3662,7 @@
           <w:rFonts w:ascii="Arial" w:cs="Arial" w:eastAsia="Arial" w:hAnsi="Arial"/>
           <w:rtl w:val="0"/>
         </w:rPr>
-        <w:t xml:space="preserve">Este desglose permite evaluar de manera integral la inversión necesaria para el desarrollo del prototipo y su futura escalabilidad</w:t>
+        <w:t>Este desglose permite evaluar de manera integral la inversión necesaria para el desarrollo del prototipo y su futura escalabilidad El costo de infraestructura corresponde al plan Hostinger VPS KVM 2 (COP 28.900 mensuales en promoción, 24 meses prepagados: COP 693.600) más un dominio estimado en COP 50.000 por año; la tarifa de renovación del plan es de COP 50.900 mensuales.</w:t>
       </w:r>
     </w:p>
     <w:p>
@@ -3687,7 +3907,7 @@
           <w:vertAlign w:val="baseline"/>
           <w:rtl w:val="0"/>
         </w:rPr>
-        <w:t xml:space="preserve">Ajuste de fallas en la aplicación móvil/web (errores de carga, notificaciones, reportes).</w:t>
+        <w:t>Ajuste de fallas en la aplicación móvil/web (errores de carga, notificaciones, historial y estadísticas de consumo).</w:t>
       </w:r>
     </w:p>
     <w:p>
@@ -3797,7 +4017,7 @@
           <w:vertAlign w:val="baseline"/>
           <w:rtl w:val="0"/>
         </w:rPr>
-        <w:t xml:space="preserve">Actualización periódica del software y librerías utilizadas.</w:t>
+        <w:t>Actualización periódica del software y las librerías utilizadas (Spring Boot, Spring Cloud Gateway, RabbitMQ, React, Expo y firmware del ESP32).</w:t>
       </w:r>
     </w:p>
     <w:p>
@@ -3911,7 +4131,7 @@
           <w:vertAlign w:val="baseline"/>
           <w:rtl w:val="0"/>
         </w:rPr>
-        <w:t xml:space="preserve">Copias de seguridad de la base de datos en la nube para prevenir pérdida de información.</w:t>
+        <w:t>Copias de seguridad periódicas de la base de datos MySQL del servidor VPS (respaldos y snapshots del proveedor) para prevenir pérdida de información.</w:t>
       </w:r>
     </w:p>
     <w:p>
@@ -4039,7 +4259,7 @@
           <w:vertAlign w:val="baseline"/>
           <w:rtl w:val="0"/>
         </w:rPr>
-        <w:t xml:space="preserve">Inclusión de nuevas funcionalidades solicitadas por los usuarios (por ejemplo, integración con medidores inteligentes).</w:t>
+        <w:t>Inclusión de nuevas funcionalidades solicitadas por los usuarios (por ejemplo, integración con medidores inteligentes, actualización del firmware por aire, que hoy exige cable USB, y una interfaz de administración).</w:t>
       </w:r>
     </w:p>
     <w:p>
@@ -4215,6 +4435,63 @@
     </w:p>
     <w:p>
       <w:pPr>
+        <w:keepNext w:val="0"/>
+        <w:keepLines w:val="0"/>
+        <w:pageBreakBefore w:val="0"/>
+        <w:widowControl w:val="1"/>
+        <w:numPr>
+          <w:ilvl w:val="0"/>
+          <w:numId w:val="4"/>
+        </w:numPr>
+        <w:pBdr>
+          <w:top w:space="0" w:sz="0" w:val="nil"/>
+          <w:left w:space="0" w:sz="0" w:val="nil"/>
+          <w:bottom w:space="0" w:sz="0" w:val="nil"/>
+          <w:right w:space="0" w:sz="0" w:val="nil"/>
+          <w:between w:space="0" w:sz="0" w:val="nil"/>
+        </w:pBdr>
+        <w:shd w:fill="auto" w:val="clear"/>
+        <w:spacing w:after="160" w:before="0" w:line="278.00000000000006" w:lineRule="auto"/>
+        <w:ind w:left="720" w:right="0" w:hanging="360"/>
+        <w:jc w:val="left"/>
+        <w:rPr>
+          <w:rFonts w:ascii="Arial" w:cs="Arial" w:eastAsia="Arial" w:hAnsi="Arial"/>
+          <w:b w:val="0"/>
+          <w:bCs w:val="0"/>
+          <w:i w:val="0"/>
+          <w:iCs w:val="0"/>
+          <w:smallCaps w:val="0"/>
+          <w:strike w:val="0"/>
+          <w:color w:val="000000"/>
+          <w:sz w:val="24"/>
+          <w:szCs w:val="24"/>
+          <w:u w:val="none"/>
+          <w:shd w:fill="auto" w:val="clear"/>
+          <w:vertAlign w:val="baseline"/>
+        </w:rPr>
+      </w:pPr>
+      <w:r>
+        <w:rPr>
+          <w:rFonts w:ascii="Arial" w:cs="Arial" w:eastAsia="Arial" w:hAnsi="Arial"/>
+          <w:b w:val="0"/>
+          <w:bCs w:val="0"/>
+          <w:i w:val="0"/>
+          <w:iCs w:val="0"/>
+          <w:smallCaps w:val="0"/>
+          <w:strike w:val="0"/>
+          <w:color w:val="000000"/>
+          <w:sz w:val="24"/>
+          <w:szCs w:val="24"/>
+          <w:u w:val="none"/>
+          <w:shd w:fill="auto" w:val="clear"/>
+          <w:vertAlign w:val="baseline"/>
+          <w:rtl w:val="0"/>
+        </w:rPr>
+        <w:t>Culminación de la migración a microservicios de los módulos que aún permanecen en el backend (hogares, alertas, recomendaciones y notificaciones), actualmente en curso.</w:t>
+      </w:r>
+    </w:p>
+    <w:p>
+      <w:pPr>
         <w:rPr>
           <w:rFonts w:ascii="Arial" w:cs="Arial" w:eastAsia="Arial" w:hAnsi="Arial"/>
         </w:rPr>
@@ -4410,7 +4687,7 @@
           <w:vertAlign w:val="baseline"/>
           <w:rtl w:val="0"/>
         </w:rPr>
-        <w:t xml:space="preserve">Alcance de la licencia otorgada a los usuarios finales (uso personal, no comercial).</w:t>
+        <w:t>Alcance de la licencia otorgada: uso, copia y modificación libres con fines educativos, investigativos y sociales, manteniendo la referencia al equipo desarrollador y al SENA; el uso comercial requiere un acuerdo formal.</w:t>
       </w:r>
     </w:p>
     <w:p>
@@ -4467,7 +4744,7 @@
           <w:vertAlign w:val="baseline"/>
           <w:rtl w:val="0"/>
         </w:rPr>
-        <w:t xml:space="preserve">Restricciones de copia, modificación y distribución no autorizada.</w:t>
+        <w:t>Las versiones modificadas deben indicar los cambios realizados, no pueden eliminar la autoría original y deben compartirse bajo los mismos términos.</w:t>
       </w:r>
     </w:p>
     <w:p>
@@ -4524,7 +4801,7 @@
           <w:vertAlign w:val="baseline"/>
           <w:rtl w:val="0"/>
         </w:rPr>
-        <w:t xml:space="preserve">Posibilidad de futuras adaptaciones a licencias abiertas (ej. MIT, GPL) en caso de que el proyecto evolucione hacia un modelo de software libre.</w:t>
+        <w:t>Posibilidad de futuras adaptaciones a licencias abiertas estándar (ej. MIT, GPL) en caso de que el proyecto evolucione hacia un modelo de software libre.</w:t>
       </w:r>
     </w:p>
     <w:p>

</xml_diff>